<commit_message>
Implementacion del sistema en Python 3 y actualizacion de informe tecnico
</commit_message>
<xml_diff>
--- a/INFORME_PARCIAL_ESTRUCTURA_DATOS.docx
+++ b/INFORME_PARCIAL_ESTRUCTURA_DATOS.docx
@@ -28,9 +28,9 @@
           <w:color w:val="4A5568"/>
           <w:sz w:val="22"/>
         </w:rPr>
-        <w:t>FACULTAD DE INGENIERÍA</w:t>
+        <w:t>FACULTAD DE INGENIERIA</w:t>
         <w:br/>
-        <w:t>ESCUELA ACADÉMICO PROFESIONAL DE INGENIERÍA DE SISTEMAS E INFORMÁTICA</w:t>
+        <w:t>ESCUELA ACADEMICO PROFESIONAL DE INGENIERIA DE SISTEMAS E INFORMATICA</w:t>
       </w:r>
     </w:p>
     <w:p>
@@ -45,7 +45,7 @@
           <w:color w:val="C53030"/>
           <w:sz w:val="40"/>
         </w:rPr>
-        <w:t>INFORME TÉCNICO DE EXAMEN PARCIAL</w:t>
+        <w:t>INFORME TECNICO DE EXAMEN PARCIAL</w:t>
         <w:br/>
         <w:t>ESTRUCTURA DE DATOS</w:t>
       </w:r>
@@ -62,9 +62,9 @@
           <w:color w:val="2B6CB0"/>
           <w:sz w:val="26"/>
         </w:rPr>
-        <w:t>CASO PRÁCTICO: GESTIÓN DE UNA FLOTA DE VEHÍCULOS ELÉCTRICOS</w:t>
+        <w:t>CASO PRACTICO: GESTION DE UNA FLOTA DE VEHICULOS ELECTRICOS</w:t>
         <w:br/>
-        <w:t>Tipo D - Evaluación Individual</w:t>
+        <w:t>Tipo D - Evaluacion Individual</w:t>
       </w:r>
     </w:p>
     <w:tbl>
@@ -207,7 +207,7 @@
                 <w:color w:val="2D3748"/>
                 <w:sz w:val="19"/>
               </w:rPr>
-              <w:t>SECCIÓN:</w:t>
+              <w:t>SECCION:</w:t>
             </w:r>
           </w:p>
         </w:tc>
@@ -313,7 +313,7 @@
                 <w:color w:val="2D3748"/>
                 <w:sz w:val="19"/>
               </w:rPr>
-              <w:t>ESCALA DE CALIFICACIÓN:</w:t>
+              <w:t>LENGUAJE:</w:t>
             </w:r>
           </w:p>
         </w:tc>
@@ -338,7 +338,60 @@
                 <w:color w:val="1A202C"/>
                 <w:sz w:val="19"/>
               </w:rPr>
-              <w:t>0 a 20 puntos (12 pts Código + 8 pts Informe)</w:t>
+              <w:t>Python 3 (Estandar Estructurado)</w:t>
+            </w:r>
+          </w:p>
+        </w:tc>
+      </w:tr>
+      <w:tr>
+        <w:tc>
+          <w:tcPr>
+            <w:tcW w:type="dxa" w:w="4680"/>
+            <w:shd w:fill="EDF2F7"/>
+            <w:tcMar>
+              <w:top w:w="60" w:type="dxa"/>
+              <w:bottom w:w="60" w:type="dxa"/>
+              <w:left w:w="100" w:type="dxa"/>
+              <w:right w:w="100" w:type="dxa"/>
+            </w:tcMar>
+          </w:tcPr>
+          <w:p>
+            <w:pPr>
+              <w:spacing w:after="0"/>
+            </w:pPr>
+            <w:r>
+              <w:rPr>
+                <w:rFonts w:ascii="Arial" w:hAnsi="Arial"/>
+                <w:b/>
+                <w:color w:val="2D3748"/>
+                <w:sz w:val="19"/>
+              </w:rPr>
+              <w:t>ESCALA DE CALIFICACION:</w:t>
+            </w:r>
+          </w:p>
+        </w:tc>
+        <w:tc>
+          <w:tcPr>
+            <w:tcW w:type="dxa" w:w="4680"/>
+            <w:shd w:fill="FFFFFF"/>
+            <w:tcMar>
+              <w:top w:w="60" w:type="dxa"/>
+              <w:bottom w:w="60" w:type="dxa"/>
+              <w:left w:w="100" w:type="dxa"/>
+              <w:right w:w="100" w:type="dxa"/>
+            </w:tcMar>
+          </w:tcPr>
+          <w:p>
+            <w:pPr>
+              <w:spacing w:after="0"/>
+            </w:pPr>
+            <w:r>
+              <w:rPr>
+                <w:rFonts w:ascii="Arial" w:hAnsi="Arial"/>
+                <w:color w:val="1A202C"/>
+                <w:sz w:val="19"/>
+              </w:rPr>
+              <w:t>0 a 20 puntos (12 pts Codigo + 8 pts Informe)</w:t>
             </w:r>
           </w:p>
         </w:tc>
@@ -364,7 +417,7 @@
           <w:color w:val="1A365D"/>
           <w:sz w:val="26"/>
         </w:rPr>
-        <w:t>1. Introducción</w:t>
+        <w:t>1. Introduccion</w:t>
       </w:r>
     </w:p>
     <w:p>
@@ -379,7 +432,7 @@
           <w:color w:val="2B6CB0"/>
           <w:sz w:val="22"/>
         </w:rPr>
-        <w:t>1.1. Descripción del Sistema</w:t>
+        <w:t>1.1. Descripcion del Sistema</w:t>
       </w:r>
     </w:p>
     <w:p>
@@ -392,7 +445,7 @@
           <w:color w:val="2D3748"/>
           <w:sz w:val="20"/>
         </w:rPr>
-        <w:t>En el contexto actual de transición energética y modernización del transporte urbano, la gestión operativa de flotas de vehículos 100% eléctricos (EV) plantea desafíos logísticos específicos. A diferencia de los vehículos de combustión interna tradicionales, las unidades eléctricas dependen de factores críticos como la capacidad neta de almacenamiento en sus baterías (kWh) y la tasa de eficiencia o consumo promedio (kWh/100km). El presente sistema ha sido desarrollado para satisfacer las necesidades operativas de una empresa de alquiler de vehículos eléctricos, proporcionando una solución integral en consola estructurada bajo el estándar C++.</w:t>
+        <w:t>En la gestion moderna de operaciones de transporte, las empresas de alquiler de vehiculos electricos enfrentan retos computacionales y logisticos vinculados a la autonomia de bateria. A diferencia de las unidades de combustion interna, el rendimiento de un vehiculo electrico depende de la capacidad neta de almacenamiento (kWh) y de la tasa de consumo promedio (kWh/100km). El presente sistema ha sido desarrollado en Python siguiendo un diseno modular y estructurado, permitiendo administrar el inventario, monitorear el kilometraje y generar reportes de desempeno.</w:t>
       </w:r>
     </w:p>
     <w:p>
@@ -420,7 +473,7 @@
           <w:color w:val="2D3748"/>
           <w:sz w:val="20"/>
         </w:rPr>
-        <w:t>El objetivo primordial del software es centralizar y automatizar el ciclo de vida operativo de cada unidad de la flota. Esto comprende el registro controlado de vehículos evitando colisiones de identificadores, la actualización dinámica del historial de viajes, la conmutación de estados operativos (Disponible vs. En mantenimiento), el cómputo en tiempo real de la autonomía estimada y la generación de reportes estratégicos para la toma de decisiones, tales como la detección temprana de unidades con baja autonomía y la identificación de vehículos sometidos a alta demanda de uso.</w:t>
+        <w:t>El objetivo primordial es automatizar el ciclo operativo de la flota: registro controlado sin duplicidad de ID, actualizacion de servicios completados, conmutacion de estados de disponibilidad (Disponible vs. En mantenimiento), calculo matematico en tiempo real de la autonomia estimada y emision de reportes analiticos para priorizar recargas y mantenimientos.</w:t>
       </w:r>
     </w:p>
     <w:p>
@@ -435,7 +488,7 @@
           <w:color w:val="2B6CB0"/>
           <w:sz w:val="22"/>
         </w:rPr>
-        <w:t>1.3. Justificación del Uso de Estructuras (struct) y Arreglos Unidimensionales</w:t>
+        <w:t>1.3. Justificacion del Uso de Estructuras (struct) y Arreglos Unidimensionales en Python</w:t>
       </w:r>
     </w:p>
     <w:p>
@@ -448,7 +501,7 @@
           <w:color w:val="2D3748"/>
           <w:sz w:val="20"/>
         </w:rPr>
-        <w:t>Para modelar el dominio del problema se seleccionaron dos conceptos fundamentales de la programación estructurada:</w:t>
+        <w:t>En Python, los conceptos clasicos de registros y arreglos estaticos se implementan mediante abstracciones nativas coherentes:</w:t>
       </w:r>
     </w:p>
     <w:p>
@@ -463,7 +516,7 @@
           <w:color w:val="1A202C"/>
           <w:sz w:val="20"/>
         </w:rPr>
-        <w:t xml:space="preserve">Registros (struct): </w:t>
+        <w:t xml:space="preserve">Registros (struct) mediante Clases de Atributos Puros: </w:t>
       </w:r>
       <w:r>
         <w:rPr>
@@ -471,7 +524,7 @@
           <w:color w:val="2D3748"/>
           <w:sz w:val="20"/>
         </w:rPr>
-        <w:t>Un vehículo eléctrico es una entidad compleja compuesta por atributos heterogéneos (identificador numérico entero, modelo alfanumérico, capacidad de batería real, consumo promedio real, contador de viajes entero y estado operativo). El uso de 'struct Vehiculo' permite encapsular todas estas propiedades bajo un mismo tipo de dato definido por el usuario, garantizando cohesión conceptual, paso de parámetros por referencia limpia y evitando el uso ineficiente y propenso a errores de arreglos paralelos desarticulados.</w:t>
+        <w:t>Un vehiculo electrico concentra datos heterogeneos (entero para ID, cadena para modelo, flotantes para bateria y consumo, enteros para viajes y estado). Se implemento 'class Vehiculo' exclusivamente como un registro estructurado sin metodos complejos, garantizando encapsulamiento, legibilidad y cohesión conceptual.</w:t>
       </w:r>
     </w:p>
     <w:p>
@@ -486,7 +539,7 @@
           <w:color w:val="1A202C"/>
           <w:sz w:val="20"/>
         </w:rPr>
-        <w:t xml:space="preserve">Arreglos Unidimensionales (Vectores Estáticos): </w:t>
+        <w:t xml:space="preserve">Arreglos Unidimensionales de Capacidad Estatica: </w:t>
       </w:r>
       <w:r>
         <w:rPr>
@@ -494,7 +547,7 @@
           <w:color w:val="2D3748"/>
           <w:sz w:val="20"/>
         </w:rPr>
-        <w:t>La colección de vehículos se almacena en un arreglo unidimensional estático continuo en memoria ('Vehiculo flota[MAX_VEHICULOS]'). Esta elección proporciona acceso aleatorio inmediato de orden temporal constante O(1) mediante indexación directa, predictibilidad en el consumo de memoria en la pila (stack) sin sobrecarga (overhead) de punteros dinámicos, y constituye la estructura ideal para la aplicación directa de algoritmos de ordenamiento iterativo (burbuja) y búsquedas lineales solicitadas.</w:t>
+        <w:t>Se inicializa un arreglo de tamano prefijado 'flota = [None] * MAX_VEHICULOS' gobernado por una variable 'total_vehiculos'. Esta tecnica replica con exactitud el comportamiento de los arreglos estaticos de memoria contigua, permitiendo acceso O(1) y sirviendo de base para la aplicacion manual del ordenamiento por burbuja y busqueda secuencial.</w:t>
       </w:r>
     </w:p>
     <w:tbl>
@@ -536,7 +589,7 @@
                 <w:color w:val="1A365D"/>
                 <w:sz w:val="20"/>
               </w:rPr>
-              <w:t xml:space="preserve">FUNDAMENTO ARQUITECTÓNICO: </w:t>
+              <w:t xml:space="preserve">ENFOQUE PEDAGOGICO EN PYTHON: </w:t>
             </w:r>
             <w:r>
               <w:rPr>
@@ -544,7 +597,7 @@
                 <w:color w:val="2D3748"/>
                 <w:sz w:val="19"/>
               </w:rPr>
-              <w:t>La combinación de registros (struct) y arreglos unidimensionales estáticos modela fielmente las arquitecturas de sistemas embebidos y aplicaciones de control industrial, donde los recursos de memoria son finitos y se prioriza la simplicidad, predictibilidad y rendimiento determinístico.</w:t>
+              <w:t>La implementacion de 'class Vehiculo' como registro de campos puros y la reserva previa de memoria con '[None] * MAX_VEHICULOS' permite estudiar y demostrar la mecanica de estructuras de datos estaticas sin recurrir a metodos opacos de alto nivel.</w:t>
             </w:r>
           </w:p>
         </w:tc>
@@ -570,7 +623,7 @@
           <w:color w:val="1A365D"/>
           <w:sz w:val="26"/>
         </w:rPr>
-        <w:t>2. Lógica del Ingreso de Datos</w:t>
+        <w:t>2. Logica del Ingreso de Datos</w:t>
       </w:r>
     </w:p>
     <w:p>
@@ -598,7 +651,7 @@
           <w:color w:val="2D3748"/>
           <w:sz w:val="20"/>
         </w:rPr>
-        <w:t>El flujo de captura de datos sigue una secuencia rigurosa que impide que un registro corrupto o inconsistente ingrese al estado del programa. El proceso se ejecuta en los siguientes pasos:</w:t>
+        <w:t>El flujo de captura asegura que ninguna unidad con datos incongruentes se registre en el sistema:</w:t>
       </w:r>
     </w:p>
     <w:p>
@@ -613,7 +666,7 @@
           <w:color w:val="1A202C"/>
           <w:sz w:val="20"/>
         </w:rPr>
-        <w:t xml:space="preserve">1. Verificación de capacidad: </w:t>
+        <w:t xml:space="preserve">1. Verificacion de capacidad: </w:t>
       </w:r>
       <w:r>
         <w:rPr>
@@ -621,7 +674,7 @@
           <w:color w:val="2D3748"/>
           <w:sz w:val="20"/>
         </w:rPr>
-        <w:t>Se valida preliminarmente que el contador 'totalVehiculos' sea estrictamente menor que 'MAX_VEHICULOS'.</w:t>
+        <w:t>Se valida preliminarmente que 'total &lt; MAX_VEHICULOS'.</w:t>
       </w:r>
     </w:p>
     <w:p>
@@ -636,7 +689,7 @@
           <w:color w:val="1A202C"/>
           <w:sz w:val="20"/>
         </w:rPr>
-        <w:t xml:space="preserve">2. Captura y verificación de ID: </w:t>
+        <w:t xml:space="preserve">2. Captura y validacion de ID unico: </w:t>
       </w:r>
       <w:r>
         <w:rPr>
@@ -644,7 +697,7 @@
           <w:color w:val="2D3748"/>
           <w:sz w:val="20"/>
         </w:rPr>
-        <w:t>Se solicita el identificador numérico y se verifica inmediatamente su inexistencia en el arreglo mediante búsqueda secuencial.</w:t>
+        <w:t>Se lee el ID y se ejecuta una busqueda secuencial para garantizar que no exista colision.</w:t>
       </w:r>
     </w:p>
     <w:p>
@@ -667,7 +720,7 @@
           <w:color w:val="2D3748"/>
           <w:sz w:val="20"/>
         </w:rPr>
-        <w:t>Se utiliza 'getline(cin, nuevo.modelo)' para permitir nombres comerciales con espacios compuestos (ej. 'Tesla Model 3', 'Hyundai Ioniq 5').</w:t>
+        <w:t>Se captura la cadena permitiendo espacios y validando que no quede en blanco.</w:t>
       </w:r>
     </w:p>
     <w:p>
@@ -682,7 +735,7 @@
           <w:color w:val="1A202C"/>
           <w:sz w:val="20"/>
         </w:rPr>
-        <w:t xml:space="preserve">4. Captura de capacidad y consumo: </w:t>
+        <w:t xml:space="preserve">4. Captura de bateria y consumo: </w:t>
       </w:r>
       <w:r>
         <w:rPr>
@@ -690,7 +743,7 @@
           <w:color w:val="2D3748"/>
           <w:sz w:val="20"/>
         </w:rPr>
-        <w:t>Se leen valores decimales float mediante funciones especializadas con validación de cota superior a cero.</w:t>
+        <w:t>Se solicitan valores numericos mayores que cero (&gt; 0).</w:t>
       </w:r>
     </w:p>
     <w:p>
@@ -713,7 +766,30 @@
           <w:color w:val="2D3748"/>
           <w:sz w:val="20"/>
         </w:rPr>
-        <w:t>Se valida que los viajes sean no negativos (&gt;= 0) y que el estado pertenezca estrictamente al dominio {1, 2}.</w:t>
+        <w:t>Se valida que los viajes sean no negativos (&gt;= 0) y que el estado sea estrictamente 1 o 2.</w:t>
+      </w:r>
+    </w:p>
+    <w:p>
+      <w:pPr>
+        <w:pStyle w:val="ListBullet"/>
+        <w:spacing w:after="60" w:line="276" w:lineRule="auto"/>
+      </w:pPr>
+      <w:r>
+        <w:rPr>
+          <w:rFonts w:ascii="Arial" w:hAnsi="Arial"/>
+          <w:b/>
+          <w:color w:val="1A202C"/>
+          <w:sz w:val="20"/>
+        </w:rPr>
+        <w:t xml:space="preserve">6. Insercion: </w:t>
+      </w:r>
+      <w:r>
+        <w:rPr>
+          <w:rFonts w:ascii="Arial" w:hAnsi="Arial"/>
+          <w:color w:val="2D3748"/>
+          <w:sz w:val="20"/>
+        </w:rPr>
+        <w:t>Se instancia 'Vehiculo(...)' en 'flota[total]' y se incrementa el contador.</w:t>
       </w:r>
     </w:p>
     <w:p>
@@ -743,7 +819,7 @@
           <w:color w:val="1A202C"/>
           <w:sz w:val="20"/>
         </w:rPr>
-        <w:t xml:space="preserve">ID Único: </w:t>
+        <w:t xml:space="preserve">ID Unico: </w:t>
       </w:r>
       <w:r>
         <w:rPr>
@@ -751,7 +827,7 @@
           <w:color w:val="2D3748"/>
           <w:sz w:val="20"/>
         </w:rPr>
-        <w:t>Se ejecuta una llamada a 'buscarVehiculoPorId(flota, total, id)'. Si el valor retornado es distinto de -1, se rechaza la entrada y se exige un nuevo ID.</w:t>
+        <w:t>La funcion 'buscar_vehiculo_por_id' debe retornar -1. Si retorna una posicion valida, se bloquea la insercion.</w:t>
       </w:r>
     </w:p>
     <w:p>
@@ -774,7 +850,7 @@
           <w:color w:val="2D3748"/>
           <w:sz w:val="20"/>
         </w:rPr>
-        <w:t>Tanto la batería (kWh) como el consumo (kWh/100km) deben representar magnitudes físicas positivas. Se rechazan valores &lt;= 0.</w:t>
+        <w:t>Representan cantidades fisicas que deben ser estrictamente positivas.</w:t>
       </w:r>
     </w:p>
     <w:p>
@@ -797,7 +873,7 @@
           <w:color w:val="2D3748"/>
           <w:sz w:val="20"/>
         </w:rPr>
-        <w:t>El odómetro o contador de servicios de una unidad no puede ser negativo. Se exige n &gt;= 0.</w:t>
+        <w:t>El historial de viajes no puede ser negativo.</w:t>
       </w:r>
     </w:p>
     <w:p>
@@ -812,7 +888,7 @@
           <w:color w:val="1A202C"/>
           <w:sz w:val="20"/>
         </w:rPr>
-        <w:t xml:space="preserve">Estado Operativo (1 o 2): </w:t>
+        <w:t xml:space="preserve">Estado (1 o 2): </w:t>
       </w:r>
       <w:r>
         <w:rPr>
@@ -820,7 +896,7 @@
           <w:color w:val="2D3748"/>
           <w:sz w:val="20"/>
         </w:rPr>
-        <w:t>Se restringe la entrada a 1 (Disponible) o 2 (En mantenimiento), rechazando cualquier otro entero.</w:t>
+        <w:t>Solo se aceptan las opciones 1 (Disponible) o 2 (En mantenimiento).</w:t>
       </w:r>
     </w:p>
     <w:p>
@@ -835,7 +911,7 @@
           <w:color w:val="2B6CB0"/>
           <w:sz w:val="22"/>
         </w:rPr>
-        <w:t>2.3. Uso de Estructuras de Control (IF, WHILE, FOR)</w:t>
+        <w:t>2.3. Uso de Estructuras de Control (WHILE, IF, FOR)</w:t>
       </w:r>
     </w:p>
     <w:p>
@@ -848,7 +924,7 @@
           <w:color w:val="2D3748"/>
           <w:sz w:val="20"/>
         </w:rPr>
-        <w:t>La validación combina estructuras condicionales 'if-else' y bucles interactivos 'while(true)'. A diferencia de una simple advertencia condicional con 'if', el uso de bucles 'while' obliga al operador a reintentar el ingreso de manera continua hasta suministrar un valor válido, impidiendo el avance con datos erróneos.</w:t>
+        <w:t>Se implementan bucles interactivos 'while True' complementados con sentencias condicionales 'if-else'. Esto retiene al usuario en el campo erroneo hasta que proporcione un valor admisible, impidiendo el avance con datos corruptos.</w:t>
       </w:r>
     </w:p>
     <w:p>
@@ -863,7 +939,7 @@
           <w:color w:val="2B6CB0"/>
           <w:sz w:val="22"/>
         </w:rPr>
-        <w:t>2.4. Manejo de Errores (Ingreso de Caracteres no Numéricos)</w:t>
+        <w:t>2.4. Manejo de Errores (Ingreso de Letras en Campos Numericos)</w:t>
       </w:r>
     </w:p>
     <w:p>
@@ -876,7 +952,7 @@
           <w:color w:val="2D3748"/>
           <w:sz w:val="20"/>
         </w:rPr>
-        <w:t>Uno de los fallos más comunes en aplicaciones C++ de consola ocurre cuando se ingresan letras o caracteres alfanuméricos en flujos 'cin &gt;&gt; variable_numerica'. Esto activa el banderín de fallo 'cin.fail()', interrumpe el flujo de entrada y genera bucles infinitos descontrolados. Para mitigar completamente este riesgo, se implementó una rutina robusta de sanitización del buffer:</w:t>
+        <w:t>En Python, convertir una cadena con letras a entero o flotante genera una excepcion 'ValueError'. Para evitar que el programa aborte, se implementaron funciones de lectura con bloques 'try-except':</w:t>
       </w:r>
     </w:p>
     <w:tbl>
@@ -917,42 +993,40 @@
                 <w:color w:val="282C34"/>
                 <w:sz w:val="17"/>
               </w:rPr>
-              <w:t>void limpiarBuffer() {</w:t>
+              <w:t>def leer_entero(mensaje: str) -&gt; int:</w:t>
               <w:br/>
-              <w:t xml:space="preserve">    cin.clear();            // Restablece los flags de error del flujo cin</w:t>
+              <w:t xml:space="preserve">    while True:</w:t>
               <w:br/>
-              <w:t xml:space="preserve">    cin.ignore(10000, '\n'); // Descarta caracteres espurios del buffer hasta el salto de linea</w:t>
+              <w:t xml:space="preserve">        entrada = input(mensaje).strip()</w:t>
               <w:br/>
-              <w:t>}</w:t>
+              <w:t xml:space="preserve">        try:</w:t>
+              <w:br/>
+              <w:t xml:space="preserve">            return int(entrada)</w:t>
+              <w:br/>
+              <w:t xml:space="preserve">        except ValueError:</w:t>
+              <w:br/>
+              <w:t xml:space="preserve">            print("   [Error] Entrada invalida. Debe ingresar un numero entero.")</w:t>
               <w:br/>
               <w:br/>
-              <w:t>float leerFloatPositivo(const string&amp; mensaje) {</w:t>
+              <w:t>def leer_float_positivo(mensaje: str) -&gt; float:</w:t>
               <w:br/>
-              <w:t xml:space="preserve">    float valor;</w:t>
+              <w:t xml:space="preserve">    while True:</w:t>
               <w:br/>
-              <w:t xml:space="preserve">    while (true) {</w:t>
+              <w:t xml:space="preserve">        entrada = input(mensaje).strip()</w:t>
               <w:br/>
-              <w:t xml:space="preserve">        cout &lt;&lt; mensaje;</w:t>
+              <w:t xml:space="preserve">        try:</w:t>
               <w:br/>
-              <w:t xml:space="preserve">        if (cin &gt;&gt; valor) {</w:t>
+              <w:t xml:space="preserve">            valor = float(entrada)</w:t>
               <w:br/>
-              <w:t xml:space="preserve">            limpiarBuffer();</w:t>
+              <w:t xml:space="preserve">            if valor &gt; 0.0:</w:t>
               <w:br/>
-              <w:t xml:space="preserve">            if (valor &gt; 0.0f) return valor;</w:t>
+              <w:t xml:space="preserve">                return valor</w:t>
               <w:br/>
-              <w:t xml:space="preserve">            cout &lt;&lt; "   [Error] El valor debe ser estrictamente mayor que cero (&gt; 0).\n";</w:t>
+              <w:t xml:space="preserve">            print("   [Error] El valor debe ser estrictamente mayor que cero (&gt; 0).")</w:t>
               <w:br/>
-              <w:t xml:space="preserve">        } else {</w:t>
+              <w:t xml:space="preserve">        except ValueError:</w:t>
               <w:br/>
-              <w:t xml:space="preserve">            cout &lt;&lt; "   [Error] Entrada invalida. Ingrese un valor numerico valido.\n";</w:t>
-              <w:br/>
-              <w:t xml:space="preserve">            limpiarBuffer();</w:t>
-              <w:br/>
-              <w:t xml:space="preserve">        }</w:t>
-              <w:br/>
-              <w:t xml:space="preserve">    }</w:t>
-              <w:br/>
-              <w:t>}</w:t>
+              <w:t xml:space="preserve">            print("   [Error] Entrada invalida. Ingrese un valor numerico valido.")</w:t>
             </w:r>
           </w:p>
         </w:tc>
@@ -970,7 +1044,7 @@
           <w:color w:val="718096"/>
           <w:sz w:val="17"/>
         </w:rPr>
-        <w:t>Fragmento: Control de excepciones de entrada por teclado y vaciado de buffer</w:t>
+        <w:t>Fragmento: Control de excepciones ante entrada de texto en campos numericos</w:t>
       </w:r>
     </w:p>
     <w:p>
@@ -988,7 +1062,7 @@
           <w:color w:val="1A365D"/>
           <w:sz w:val="26"/>
         </w:rPr>
-        <w:t>3. Lógica de Almacenamiento</w:t>
+        <w:t>3. Logica de Almacenamiento</w:t>
       </w:r>
     </w:p>
     <w:p>
@@ -1003,7 +1077,7 @@
           <w:color w:val="2B6CB0"/>
           <w:sz w:val="22"/>
         </w:rPr>
-        <w:t>3.1. Uso del Arreglo Unidimensional para Almacenar Vehículos</w:t>
+        <w:t>3.1. Uso del Arreglo Unidimensional para Almacenar Vehiculos</w:t>
       </w:r>
     </w:p>
     <w:p>
@@ -1016,7 +1090,7 @@
           <w:color w:val="2D3748"/>
           <w:sz w:val="20"/>
         </w:rPr>
-        <w:t>La flota completa reside en la variable 'Vehiculo flota[MAX_VEHICULOS];'. Cada celda del arreglo almacena una instancia completa del registro 'Vehiculo'. Al trabajar con estructuras en arreglos unidimensionales en C++, los datos se distribuyen de forma secuencial y contigua en memoria física, lo cual maximiza la localidad espacial y el aprovechamiento de la memoria caché del procesador (Cache L1/L2) durante los recorridos y ordenamientos.</w:t>
+        <w:t>La flota se almacena en la estructura 'flota = [None] * MAX_VEHICULOS'. Cada celda almacena la referencia a una instancia del registro 'Vehiculo'. Al indexarse mediante posiciones contiguas [0, MAX_VEHICULOS - 1], se accede a cualquier unidad en tiempo O(1).</w:t>
       </w:r>
     </w:p>
     <w:p>
@@ -1031,7 +1105,7 @@
           <w:color w:val="2B6CB0"/>
           <w:sz w:val="22"/>
         </w:rPr>
-        <w:t>3.2. Control del Número de Elementos (Variable Contador)</w:t>
+        <w:t>3.2. Control del Numero de Elementos (Variable Contador)</w:t>
       </w:r>
     </w:p>
     <w:p>
@@ -1044,7 +1118,7 @@
           <w:color w:val="2D3748"/>
           <w:sz w:val="20"/>
         </w:rPr>
-        <w:t>Debido a que el arreglo posee una dimensión física fija de 100 elementos ('MAX_VEHICULOS = 100'), es indispensable mantener una variable de tamaño lógico: 'int totalVehiculos'. Esta variable inicia en 0 (o en 4 si se consideran los registros de prueba iniciales) y cumple tres roles determinantes:</w:t>
+        <w:t>La variable 'total_vehiculos' gestiona el tamano logico de la coleccion:</w:t>
       </w:r>
     </w:p>
     <w:p>
@@ -1059,7 +1133,7 @@
           <w:color w:val="1A202C"/>
           <w:sz w:val="20"/>
         </w:rPr>
-        <w:t xml:space="preserve">Puntero de inserción: </w:t>
+        <w:t xml:space="preserve">Indice de asignacion: </w:t>
       </w:r>
       <w:r>
         <w:rPr>
@@ -1067,7 +1141,7 @@
           <w:color w:val="2D3748"/>
           <w:sz w:val="20"/>
         </w:rPr>
-        <w:t>Indica exactamente el índice de la siguiente posición libre en el arreglo ('flota[totalVehiculos] = nuevo').</w:t>
+        <w:t>Determina la posicion de escritura libre: 'flota[total] = nuevo'.</w:t>
       </w:r>
     </w:p>
     <w:p>
@@ -1082,7 +1156,7 @@
           <w:color w:val="1A202C"/>
           <w:sz w:val="20"/>
         </w:rPr>
-        <w:t xml:space="preserve">Límite de recorrido: </w:t>
+        <w:t xml:space="preserve">Frontera de iteracion: </w:t>
       </w:r>
       <w:r>
         <w:rPr>
@@ -1090,7 +1164,7 @@
           <w:color w:val="2D3748"/>
           <w:sz w:val="20"/>
         </w:rPr>
-        <w:t>Define el límite superior estricto (&lt; total) para todos los bucles de búsqueda, cálculo, ordenamiento y reportes, evitando acceder a posiciones de memoria no inicializadas.</w:t>
+        <w:t>Define el rango util 'range(total)' para busquedas, listados, calculos y ordenamiento.</w:t>
       </w:r>
     </w:p>
     <w:p>
@@ -1105,7 +1179,7 @@
           <w:color w:val="1A202C"/>
           <w:sz w:val="20"/>
         </w:rPr>
-        <w:t xml:space="preserve">Guarda de desbordamiento: </w:t>
+        <w:t xml:space="preserve">Barrera de desbordamiento: </w:t>
       </w:r>
       <w:r>
         <w:rPr>
@@ -1113,7 +1187,7 @@
           <w:color w:val="2D3748"/>
           <w:sz w:val="20"/>
         </w:rPr>
-        <w:t>Permite evaluar la condición 'total &gt;= MAX_VEHICULOS' antes de iniciar cualquier operación de escritura.</w:t>
+        <w:t>Permite evaluar 'total &gt;= MAX_VEHICULOS' antes de permitir nuevos registros.</w:t>
       </w:r>
     </w:p>
     <w:p>
@@ -1128,20 +1202,7 @@
           <w:color w:val="2B6CB0"/>
           <w:sz w:val="22"/>
         </w:rPr>
-        <w:t>3.3. Limitaciones del Enfoque Estático</w:t>
-      </w:r>
-    </w:p>
-    <w:p>
-      <w:pPr>
-        <w:spacing w:after="120" w:line="276" w:lineRule="auto"/>
-      </w:pPr>
-      <w:r>
-        <w:rPr>
-          <w:rFonts w:ascii="Arial" w:hAnsi="Arial"/>
-          <w:color w:val="2D3748"/>
-          <w:sz w:val="20"/>
-        </w:rPr>
-        <w:t>El modelo de asignación estática presenta ventajas de simplicidad, pero acarrea limitaciones técnicas severas en entornos de producción:</w:t>
+        <w:t>3.3. Limitaciones del Enfoque Estatico</w:t>
       </w:r>
     </w:p>
     <w:p>
@@ -1156,7 +1217,7 @@
           <w:color w:val="1A202C"/>
           <w:sz w:val="20"/>
         </w:rPr>
-        <w:t xml:space="preserve">Riesgo de saturación (Capacidad finita): </w:t>
+        <w:t xml:space="preserve">Capacidad Maxima Fija: </w:t>
       </w:r>
       <w:r>
         <w:rPr>
@@ -1164,7 +1225,7 @@
           <w:color w:val="2D3748"/>
           <w:sz w:val="20"/>
         </w:rPr>
-        <w:t>Si la flota crece y supera las 100 unidades, el sistema debe rechazar nuevos registros de manera forzosa, interrumpiendo la escalabilidad del negocio a menos que se modifique el código fuente y se recompile.</w:t>
+        <w:t>Al alcanzar las 100 unidades, el sistema debe rechazar nuevos ingresos a menos que se modifique el codigo.</w:t>
       </w:r>
     </w:p>
     <w:p>
@@ -1179,7 +1240,7 @@
           <w:color w:val="1A202C"/>
           <w:sz w:val="20"/>
         </w:rPr>
-        <w:t xml:space="preserve">Desperdicio de memoria (Underutilization): </w:t>
+        <w:t xml:space="preserve">Memoria Reservada Ociosa: </w:t>
       </w:r>
       <w:r>
         <w:rPr>
@@ -1187,7 +1248,7 @@
           <w:color w:val="2D3748"/>
           <w:sz w:val="20"/>
         </w:rPr>
-        <w:t>Si la empresa sólo opera 5 vehículos, el sistema continúa reservando en memoria el espacio de 100 registros (aproximadamente 100 * 48 bytes = 4.8 KB en la pila), lo cual en entornos reducidos representa memoria ociosa.</w:t>
+        <w:t>Si la flota solo tiene 5 vehiculos, los 95 elementos restantes permanecen reservados como 'None'.</w:t>
       </w:r>
     </w:p>
     <w:p>
@@ -1202,7 +1263,7 @@
           <w:color w:val="1A202C"/>
           <w:sz w:val="20"/>
         </w:rPr>
-        <w:t xml:space="preserve">Falta de flexibilidad en tiempo de ejecución: </w:t>
+        <w:t xml:space="preserve">Falta de Elasticidad: </w:t>
       </w:r>
       <w:r>
         <w:rPr>
@@ -1210,7 +1271,7 @@
           <w:color w:val="2D3748"/>
           <w:sz w:val="20"/>
         </w:rPr>
-        <w:t>No es posible compactar la memoria ni solicitar bloques adicionales bajo demanda sin migrar a estructuras dinámicas (memoria heap).</w:t>
+        <w:t>No permite crecimiento dinamico automatico bajo demanda en tiempo de ejecucion.</w:t>
       </w:r>
     </w:p>
     <w:p>
@@ -1228,7 +1289,7 @@
           <w:color w:val="1A365D"/>
           <w:sz w:val="26"/>
         </w:rPr>
-        <w:t>4. Lógica de Actualización</w:t>
+        <w:t>4. Logica de Actualizacion</w:t>
       </w:r>
     </w:p>
     <w:p>
@@ -1243,7 +1304,7 @@
           <w:color w:val="2B6CB0"/>
           <w:sz w:val="22"/>
         </w:rPr>
-        <w:t>4.1. Procedimiento para Actualizar el Número de Viajes</w:t>
+        <w:t>4.1. Procedimiento para Actualizar el Numero de Viajes</w:t>
       </w:r>
     </w:p>
     <w:p>
@@ -1256,7 +1317,7 @@
           <w:color w:val="2D3748"/>
           <w:sz w:val="20"/>
         </w:rPr>
-        <w:t>La operación de actualización de viajes ('actualizarViajes') permite modificar el historial de servicios de una unidad cuando esta regresa de un ciclo de alquiler o culmina una jornada operativa. El procedimiento no recrea la unidad, sino que modifica directamente el campo 'viajesRealizados' del registro existente por referencia en memoria.</w:t>
+        <w:t>La funcion 'actualizar_viajes' localiza el vehiculo existente y modifica su atributo 'viajes_realizados' in-place sin recrear la entidad.</w:t>
       </w:r>
     </w:p>
     <w:p>
@@ -1286,7 +1347,7 @@
           <w:color w:val="1A202C"/>
           <w:sz w:val="20"/>
         </w:rPr>
-        <w:t xml:space="preserve">Existencia de registros: </w:t>
+        <w:t xml:space="preserve">Flota con registros: </w:t>
       </w:r>
       <w:r>
         <w:rPr>
@@ -1294,7 +1355,7 @@
           <w:color w:val="2D3748"/>
           <w:sz w:val="20"/>
         </w:rPr>
-        <w:t>Se verifica que la flota no esté vacía ('total == 0').</w:t>
+        <w:t>Comprueba que existan unidades cargadas ('total &gt; 0').</w:t>
       </w:r>
     </w:p>
     <w:p>
@@ -1309,7 +1370,7 @@
           <w:color w:val="1A202C"/>
           <w:sz w:val="20"/>
         </w:rPr>
-        <w:t xml:space="preserve">Localización del vehículo: </w:t>
+        <w:t xml:space="preserve">Existencia de unidad: </w:t>
       </w:r>
       <w:r>
         <w:rPr>
@@ -1317,7 +1378,7 @@
           <w:color w:val="2D3748"/>
           <w:sz w:val="20"/>
         </w:rPr>
-        <w:t>Se solicita el ID y se ejecuta la búsqueda. Si la función retorna -1, se informa que la unidad no existe y se aborta la mutación.</w:t>
+        <w:t>Se busca el ID ingresado. Si retorna -1, se emite una notificacion y se aborta.</w:t>
       </w:r>
     </w:p>
     <w:p>
@@ -1332,7 +1393,7 @@
           <w:color w:val="1A202C"/>
           <w:sz w:val="20"/>
         </w:rPr>
-        <w:t xml:space="preserve">Consistencia del nuevo valor: </w:t>
+        <w:t xml:space="preserve">Valor no negativo: </w:t>
       </w:r>
       <w:r>
         <w:rPr>
@@ -1340,7 +1401,7 @@
           <w:color w:val="2D3748"/>
           <w:sz w:val="20"/>
         </w:rPr>
-        <w:t>Se valida mediante 'leerEnteroMayorIgual' que la nueva cifra sea mayor o igual a cero (&gt;= 0).</w:t>
+        <w:t>El nuevo valor debe ser mayor o igual a cero (&gt;= 0).</w:t>
       </w:r>
     </w:p>
     <w:p>
@@ -1355,7 +1416,7 @@
           <w:color w:val="2B6CB0"/>
           <w:sz w:val="22"/>
         </w:rPr>
-        <w:t>4.3. Uso de Búsqueda Secuencial para Localización</w:t>
+        <w:t>4.3. Uso de Busqueda Secuencial para Localizacion</w:t>
       </w:r>
     </w:p>
     <w:p>
@@ -1368,7 +1429,7 @@
           <w:color w:val="2D3748"/>
           <w:sz w:val="20"/>
         </w:rPr>
-        <w:t>Para realizar la modificación en tiempo constante una vez hallado el registro, se utiliza el índice posicional devuelto por la búsqueda secuencial: 'flota[indice].viajesRealizados = nuevosViajes;'. Al trabajar directamente sobre el arreglo pasado como parámetro, la modificación impacta de inmediato en todo el sistema.</w:t>
+        <w:t>Se aprovecha el indice devuelto por la busqueda lineal: 'flota[indice].viajes_realizados = nuevos_viajes', logrando actualizacion inmediata O(1).</w:t>
       </w:r>
     </w:p>
     <w:p>
@@ -1386,7 +1447,7 @@
           <w:color w:val="1A365D"/>
           <w:sz w:val="26"/>
         </w:rPr>
-        <w:t>5. Lógica de Ordenación</w:t>
+        <w:t>5. Logica de Ordenacion</w:t>
       </w:r>
     </w:p>
     <w:p>
@@ -1401,7 +1462,7 @@
           <w:color w:val="2B6CB0"/>
           <w:sz w:val="22"/>
         </w:rPr>
-        <w:t>5.1. Algoritmo Utilizado: Método de la Burbuja (Bubble Sort)</w:t>
+        <w:t>5.1. Algoritmo Usado: Metodo de la Burbuja (Bubble Sort)</w:t>
       </w:r>
     </w:p>
     <w:p>
@@ -1414,7 +1475,7 @@
           <w:color w:val="2D3748"/>
           <w:sz w:val="20"/>
         </w:rPr>
-        <w:t>Para dar cumplimiento estricto a las especificaciones curriculares del curso, se implementó el algoritmo clásico de ordenamiento por intercambio o Método de la Burbuja (Bubble Sort). El algoritmo efectúa pasadas sucesivas sobre el arreglo, comparando pares de elementos contiguos e intercambiándolos de posición si se encuentran en el orden incorrecto. Su complejidad temporal en el peor y caso promedio es de O(n²), con una complejidad espacial óptima de O(1) in-place.</w:t>
+        <w:t>Se implemento el algoritmo clasico de ordenamiento por intercambio (Burbuja) de forma manual y explicita, sin utilizar metodos preconstruidos de Python como '.sort()' o 'sorted()'. Efectua pasadas sucesivas comparando elementos adyacentes y trasladando los valores menores hacia el final.</w:t>
       </w:r>
     </w:p>
     <w:p>
@@ -1429,7 +1490,7 @@
           <w:color w:val="2B6CB0"/>
           <w:sz w:val="22"/>
         </w:rPr>
-        <w:t>5.2. Proceso de Ordenamiento por Autonomía (Magnitud Derivada)</w:t>
+        <w:t>5.2. Proceso de Ordenacion por Autonomia (Calculo Derivado)</w:t>
       </w:r>
     </w:p>
     <w:p>
@@ -1442,7 +1503,7 @@
           <w:color w:val="2D3748"/>
           <w:sz w:val="20"/>
         </w:rPr>
-        <w:t>El criterio de ordenación solicitado es de mayor a menor (descendente) según la autonomía estimada en kilómetros. Debido a que la autonomía no se almacena como un campo estático en la estructura, el algoritmo invoca dinámicamente la función 'calcularAutonomia()' para cada par de elementos adyacentes en cada ciclo interno:</w:t>
+        <w:t>El ordenamiento es de mayor a menor (descendente). Dado que la autonomia no es un dato estatico sino derivado, el algoritmo evalua la funcion 'calcular_autonomia()' sobre los elementos contiguos en cada iteracion interna:</w:t>
       </w:r>
     </w:p>
     <w:tbl>
@@ -1483,34 +1544,22 @@
                 <w:color w:val="282C34"/>
                 <w:sz w:val="17"/>
               </w:rPr>
-              <w:t>void ordenarVehiculosPorAutonomia(Vehiculo flota[], int total) {</w:t>
+              <w:t>def ordenar_vehiculos_por_autonomia(flota: list, total: int):</w:t>
               <w:br/>
-              <w:t xml:space="preserve">    for (int i = 0; i &lt; total - 1; i++) {</w:t>
+              <w:t xml:space="preserve">    for i in range(total - 1):</w:t>
               <w:br/>
-              <w:t xml:space="preserve">        for (int j = 0; j &lt; total - 1 - i; j++) {</w:t>
+              <w:t xml:space="preserve">        for j in range(total - 1 - i):</w:t>
               <w:br/>
-              <w:t xml:space="preserve">            float autoActual = calcularAutonomia(flota[j]);</w:t>
+              <w:t xml:space="preserve">            auto_actual = calcular_autonomia(flota[j])</w:t>
               <w:br/>
-              <w:t xml:space="preserve">            float autoSiguiente = calcularAutonomia(flota[j + 1]);</w:t>
+              <w:t xml:space="preserve">            auto_siguiente = calcular_autonomia(flota[j + 1])</w:t>
               <w:br/>
               <w:br/>
-              <w:t xml:space="preserve">            // Criterio descendente: desplaza los valores mayores hacia el inicio</w:t>
+              <w:t xml:space="preserve">            # Criterio descendente: desplaza los valores mayores hacia el inicio</w:t>
               <w:br/>
-              <w:t xml:space="preserve">            if (autoActual &lt; autoSiguiente) {</w:t>
+              <w:t xml:space="preserve">            if auto_actual &lt; auto_siguiente:</w:t>
               <w:br/>
-              <w:t xml:space="preserve">                Vehiculo auxiliar = flota[j];</w:t>
-              <w:br/>
-              <w:t xml:space="preserve">                flota[j] = flota[j + 1];</w:t>
-              <w:br/>
-              <w:t xml:space="preserve">                flota[j + 1] = auxiliar;</w:t>
-              <w:br/>
-              <w:t xml:space="preserve">            }</w:t>
-              <w:br/>
-              <w:t xml:space="preserve">        }</w:t>
-              <w:br/>
-              <w:t xml:space="preserve">    }</w:t>
-              <w:br/>
-              <w:t>}</w:t>
+              <w:t xml:space="preserve">                flota[j], flota[j + 1] = flota[j + 1], flota[j]</w:t>
             </w:r>
           </w:p>
         </w:tc>
@@ -1528,7 +1577,7 @@
           <w:color w:val="718096"/>
           <w:sz w:val="17"/>
         </w:rPr>
-        <w:t>Fragmento: Implementación de Bubble Sort descendente sobre cálculo derivado</w:t>
+        <w:t>Fragmento: Metodo de la Burbuja manual descendente sobre calculo derivado en Python</w:t>
       </w:r>
     </w:p>
     <w:p>
@@ -1543,20 +1592,7 @@
           <w:color w:val="2B6CB0"/>
           <w:sz w:val="22"/>
         </w:rPr>
-        <w:t>5.3. Justificación Técnica de Ordenar sobre el Cálculo vs. Datos Crudos</w:t>
-      </w:r>
-    </w:p>
-    <w:p>
-      <w:pPr>
-        <w:spacing w:after="120" w:line="276" w:lineRule="auto"/>
-      </w:pPr>
-      <w:r>
-        <w:rPr>
-          <w:rFonts w:ascii="Arial" w:hAnsi="Arial"/>
-          <w:color w:val="2D3748"/>
-          <w:sz w:val="20"/>
-        </w:rPr>
-        <w:t>Existen razones técnicas de peso en ingeniería de software para ordenar sobre el valor computado y no sobre un atributo prealmacenado:</w:t>
+        <w:t>5.3. Justificacion Tecnica de Ordenar sobre el Calculo vs. Datos Crudos</w:t>
       </w:r>
     </w:p>
     <w:p>
@@ -1571,7 +1607,7 @@
           <w:color w:val="1A202C"/>
           <w:sz w:val="20"/>
         </w:rPr>
-        <w:t xml:space="preserve">Principio de Única Fuente de Verdad (Single Source of Truth): </w:t>
+        <w:t xml:space="preserve">Consistencia y Fuente Unica de Verdad: </w:t>
       </w:r>
       <w:r>
         <w:rPr>
@@ -1579,7 +1615,7 @@
           <w:color w:val="2D3748"/>
           <w:sz w:val="20"/>
         </w:rPr>
-        <w:t>Si almacenáramos un campo 'float autonomia' dentro del struct, cualquier modificación futura en la capacidad de la batería o en el consumo promedio exigiría recalcular y sincronizar dicho campo manualmente. Omitir esto generaría inconsistencias graves. Calcularlo al vuelo garantiza consistencia absoluta.</w:t>
+        <w:t>Evita almacenar un campo redundante que podria desincronizarse si se alteran la bateria o el consumo.</w:t>
       </w:r>
     </w:p>
     <w:p>
@@ -1594,7 +1630,7 @@
           <w:color w:val="1A202C"/>
           <w:sz w:val="20"/>
         </w:rPr>
-        <w:t xml:space="preserve">Normalización y Ahorro de Almacenamiento: </w:t>
+        <w:t xml:space="preserve">Evaluacion Multivariable: </w:t>
       </w:r>
       <w:r>
         <w:rPr>
@@ -1602,7 +1638,68 @@
           <w:color w:val="2D3748"/>
           <w:sz w:val="20"/>
         </w:rPr>
-        <w:t>Evita redundancia de datos calculables matemáticamente a partir de magnitudes base.</w:t>
+        <w:t>La autonomia combina dos magnitudes independientes. Una bateria grande con alto consumo puede rendir menos que una bateria mediana eficiente. Ordenar sobre el calculo es la unica manera de clasificar el rendimiento real.</w:t>
+      </w:r>
+    </w:p>
+    <w:p>
+      <w:pPr>
+        <w:keepNext/>
+        <w:spacing w:before="320" w:after="120"/>
+        <w:pBdr>
+          <w:bottom w:val="single" w:sz="12" w:space="3" w:color="CBD5E0"/>
+        </w:pBdr>
+      </w:pPr>
+      <w:r>
+        <w:rPr>
+          <w:rFonts w:ascii="Arial" w:hAnsi="Arial"/>
+          <w:b/>
+          <w:color w:val="1A365D"/>
+          <w:sz w:val="26"/>
+        </w:rPr>
+        <w:t>6. Logica de Busqueda</w:t>
+      </w:r>
+    </w:p>
+    <w:p>
+      <w:pPr>
+        <w:keepNext/>
+        <w:spacing w:before="200" w:after="80"/>
+      </w:pPr>
+      <w:r>
+        <w:rPr>
+          <w:rFonts w:ascii="Arial" w:hAnsi="Arial"/>
+          <w:b/>
+          <w:color w:val="2B6CB0"/>
+          <w:sz w:val="22"/>
+        </w:rPr>
+        <w:t>6.1. Busqueda Secuencial por ID</w:t>
+      </w:r>
+    </w:p>
+    <w:p>
+      <w:pPr>
+        <w:spacing w:after="120" w:line="276" w:lineRule="auto"/>
+      </w:pPr>
+      <w:r>
+        <w:rPr>
+          <w:rFonts w:ascii="Arial" w:hAnsi="Arial"/>
+          <w:color w:val="2D3748"/>
+          <w:sz w:val="20"/>
+        </w:rPr>
+        <w:t>La funcion 'buscar_vehiculo_por_id' recorre iterativamente el arreglo desde el indice 0 hasta 'total - 1', comparando el campo 'id' de cada vehiculo con el valor buscado.</w:t>
+      </w:r>
+    </w:p>
+    <w:p>
+      <w:pPr>
+        <w:keepNext/>
+        <w:spacing w:before="200" w:after="80"/>
+      </w:pPr>
+      <w:r>
+        <w:rPr>
+          <w:rFonts w:ascii="Arial" w:hAnsi="Arial"/>
+          <w:b/>
+          <w:color w:val="2B6CB0"/>
+          <w:sz w:val="22"/>
+        </w:rPr>
+        <w:t>6.2. Casos Posibles</w:t>
       </w:r>
     </w:p>
     <w:p>
@@ -1617,7 +1714,7 @@
           <w:color w:val="1A202C"/>
           <w:sz w:val="20"/>
         </w:rPr>
-        <w:t xml:space="preserve">Evaluación Multivariable Coherente: </w:t>
+        <w:t xml:space="preserve">Encontrado: </w:t>
       </w:r>
       <w:r>
         <w:rPr>
@@ -1625,7 +1722,81 @@
           <w:color w:val="2D3748"/>
           <w:sz w:val="20"/>
         </w:rPr>
-        <w:t>Un vehículo con una batería pequeña (40 kWh) pero consumo excelente (10 kWh/100km) alcanza 400 km de autonomía, mientras que otro con batería de 60 kWh y consumo ineficiente (20 kWh/100km) solo alcanza 300 km. Ordenar únicamente por capacidad o por consumo daría una visión totalmente errónea del rendimiento de la flota.</w:t>
+        <w:t>Retorna el indice [0, total-1] para acceso directo a sus campos.</w:t>
+      </w:r>
+    </w:p>
+    <w:p>
+      <w:pPr>
+        <w:pStyle w:val="ListBullet"/>
+        <w:spacing w:after="60" w:line="276" w:lineRule="auto"/>
+      </w:pPr>
+      <w:r>
+        <w:rPr>
+          <w:rFonts w:ascii="Arial" w:hAnsi="Arial"/>
+          <w:b/>
+          <w:color w:val="1A202C"/>
+          <w:sz w:val="20"/>
+        </w:rPr>
+        <w:t xml:space="preserve">No Encontrado: </w:t>
+      </w:r>
+      <w:r>
+        <w:rPr>
+          <w:rFonts w:ascii="Arial" w:hAnsi="Arial"/>
+          <w:color w:val="2D3748"/>
+          <w:sz w:val="20"/>
+        </w:rPr>
+        <w:t>Retorna -1 tras agotar el recorrido util, activando advertencias en la interfaz.</w:t>
+      </w:r>
+    </w:p>
+    <w:p>
+      <w:pPr>
+        <w:pStyle w:val="ListBullet"/>
+        <w:spacing w:after="60" w:line="276" w:lineRule="auto"/>
+      </w:pPr>
+      <w:r>
+        <w:rPr>
+          <w:rFonts w:ascii="Arial" w:hAnsi="Arial"/>
+          <w:b/>
+          <w:color w:val="1A202C"/>
+          <w:sz w:val="20"/>
+        </w:rPr>
+        <w:t xml:space="preserve">ID Duplicado: </w:t>
+      </w:r>
+      <w:r>
+        <w:rPr>
+          <w:rFonts w:ascii="Arial" w:hAnsi="Arial"/>
+          <w:color w:val="2D3748"/>
+          <w:sz w:val="20"/>
+        </w:rPr>
+        <w:t>Se intercepta en el alta de vehiculos; si la busqueda retorna distinto de -1, se prohibe el registro.</w:t>
+      </w:r>
+    </w:p>
+    <w:p>
+      <w:pPr>
+        <w:keepNext/>
+        <w:spacing w:before="200" w:after="80"/>
+      </w:pPr>
+      <w:r>
+        <w:rPr>
+          <w:rFonts w:ascii="Arial" w:hAnsi="Arial"/>
+          <w:b/>
+          <w:color w:val="2B6CB0"/>
+          <w:sz w:val="22"/>
+        </w:rPr>
+        <w:t>6.3. Mejora Potencial: Busqueda Binaria</w:t>
+      </w:r>
+    </w:p>
+    <w:p>
+      <w:pPr>
+        <w:spacing w:after="120" w:line="276" w:lineRule="auto"/>
+      </w:pPr>
+      <w:r>
+        <w:rPr>
+          <w:rFonts w:ascii="Arial" w:hAnsi="Arial"/>
+          <w:color w:val="2D3748"/>
+          <w:sz w:val="20"/>
+        </w:rPr>
+        <w:t>Si los vehiculos se mantuviesen ordenados por ID, se podria implementar la Busqueda Binaria. Esto reduciria la complejidad de O(n) a O(log n). Para una flota de 100 unidades, el peor caso pasaria de 100 comparaciones a un maximo de 7.</w:t>
       </w:r>
     </w:p>
     <w:p>
@@ -1643,7 +1814,7 @@
           <w:color w:val="1A365D"/>
           <w:sz w:val="26"/>
         </w:rPr>
-        <w:t>6. Lógica de Búsqueda</w:t>
+        <w:t>7. Logica de Calculos</w:t>
       </w:r>
     </w:p>
     <w:p>
@@ -1658,7 +1829,7 @@
           <w:color w:val="2B6CB0"/>
           <w:sz w:val="22"/>
         </w:rPr>
-        <w:t>6.1. Búsqueda Secuencial por Identificador Único</w:t>
+        <w:t>7.1. Formula Matematica de Autonomia Estimada</w:t>
       </w:r>
     </w:p>
     <w:p>
@@ -1671,7 +1842,20 @@
           <w:color w:val="2D3748"/>
           <w:sz w:val="20"/>
         </w:rPr>
-        <w:t>La búsqueda secuencial (o lineal) implementada en 'buscarVehiculoPorId' recorre uno a uno los elementos activos desde el índice 0 hasta 'total - 1'. En cada iteración se evalúa la igualdad estricta 'flota[i].id == idBuscado'. Al encontrar una coincidencia, se interrumpe de inmediato el bucle y se retorna la posición 'i'.</w:t>
+        <w:t>La autonomia expresa los kilometros que el vehiculo puede recorrer con su carga completa:</w:t>
+      </w:r>
+    </w:p>
+    <w:p>
+      <w:pPr>
+        <w:spacing w:after="120" w:line="276" w:lineRule="auto"/>
+      </w:pPr>
+      <w:r>
+        <w:rPr>
+          <w:rFonts w:ascii="Arial" w:hAnsi="Arial"/>
+          <w:color w:val="2D3748"/>
+          <w:sz w:val="20"/>
+        </w:rPr>
+        <w:t xml:space="preserve">            Autonomia (km) = ( Capacidad de Bateria (kWh) / Consumo Promedio (kWh/100km) ) * 100</w:t>
       </w:r>
     </w:p>
     <w:p>
@@ -1686,76 +1870,20 @@
           <w:color w:val="2B6CB0"/>
           <w:sz w:val="22"/>
         </w:rPr>
-        <w:t>6.2. Análisis de Casos Posibles</w:t>
+        <w:t>7.2. Uso de Acumuladores (Promedio General de la Flota)</w:t>
       </w:r>
     </w:p>
     <w:p>
       <w:pPr>
-        <w:pStyle w:val="ListBullet"/>
-        <w:spacing w:after="60" w:line="276" w:lineRule="auto"/>
-      </w:pPr>
-      <w:r>
-        <w:rPr>
-          <w:rFonts w:ascii="Arial" w:hAnsi="Arial"/>
-          <w:b/>
-          <w:color w:val="1A202C"/>
-          <w:sz w:val="20"/>
-        </w:rPr>
-        <w:t xml:space="preserve">Caso Encontrado: </w:t>
-      </w:r>
+        <w:spacing w:after="120" w:line="276" w:lineRule="auto"/>
+      </w:pPr>
       <w:r>
         <w:rPr>
           <w:rFonts w:ascii="Arial" w:hAnsi="Arial"/>
           <w:color w:val="2D3748"/>
           <w:sz w:val="20"/>
         </w:rPr>
-        <w:t>El ID existe. Retorna el índice 'i' [0, total-1]. Permite consultar datos, actualizar viajes o alterar estados en tiempo O(1) conociendo el índice.</w:t>
-      </w:r>
-    </w:p>
-    <w:p>
-      <w:pPr>
-        <w:pStyle w:val="ListBullet"/>
-        <w:spacing w:after="60" w:line="276" w:lineRule="auto"/>
-      </w:pPr>
-      <w:r>
-        <w:rPr>
-          <w:rFonts w:ascii="Arial" w:hAnsi="Arial"/>
-          <w:b/>
-          <w:color w:val="1A202C"/>
-          <w:sz w:val="20"/>
-        </w:rPr>
-        <w:t xml:space="preserve">Caso No Encontrado: </w:t>
-      </w:r>
-      <w:r>
-        <w:rPr>
-          <w:rFonts w:ascii="Arial" w:hAnsi="Arial"/>
-          <w:color w:val="2D3748"/>
-          <w:sz w:val="20"/>
-        </w:rPr>
-        <w:t>El ID no existe tras agotar los 'n' elementos. Retorna '-1', lo cual activa mensajes claros de error al usuario y previene punteros colgantes o lecturas ilegales.</w:t>
-      </w:r>
-    </w:p>
-    <w:p>
-      <w:pPr>
-        <w:pStyle w:val="ListBullet"/>
-        <w:spacing w:after="60" w:line="276" w:lineRule="auto"/>
-      </w:pPr>
-      <w:r>
-        <w:rPr>
-          <w:rFonts w:ascii="Arial" w:hAnsi="Arial"/>
-          <w:b/>
-          <w:color w:val="1A202C"/>
-          <w:sz w:val="20"/>
-        </w:rPr>
-        <w:t xml:space="preserve">Caso ID Duplicado: </w:t>
-      </w:r>
-      <w:r>
-        <w:rPr>
-          <w:rFonts w:ascii="Arial" w:hAnsi="Arial"/>
-          <w:color w:val="2D3748"/>
-          <w:sz w:val="20"/>
-        </w:rPr>
-        <w:t>Se neutraliza en la fase de registro llamando previamente a la búsqueda. Si la búsqueda retorna distinto de -1, se prohíbe la inserción garantizando la unicidad del ID.</w:t>
+        <w:t>En la opcion 6 ('consultar_autonomia'), el sistema suma la autonomia de todos los vehiculos activos mediante un acumulador y calcula la media aritmetica dividiendo entre 'total_vehiculos', ofreciendo un indicador global de la flota.</w:t>
       </w:r>
     </w:p>
     <w:p>
@@ -1770,7 +1898,7 @@
           <w:color w:val="2B6CB0"/>
           <w:sz w:val="22"/>
         </w:rPr>
-        <w:t>6.3. Mejora Potencial: Búsqueda Binaria</w:t>
+        <w:t>7.3. Validaciones (Prevencion de Division por Cero)</w:t>
       </w:r>
     </w:p>
     <w:p>
@@ -1783,122 +1911,7 @@
           <w:color w:val="2D3748"/>
           <w:sz w:val="20"/>
         </w:rPr>
-        <w:t>Si el sistema mantuviese el arreglo permanentemente ordenado por el campo 'id' (mediante inserción ordenada o un ordenamiento previo), podría implementarse una Búsqueda Binaria (Binary Search). Esto reduciría drásticamente la complejidad computacional de O(n) a O(log₂ n). Para un arreglo de 100 vehículos, mientras que la búsqueda secuencial puede requerir hasta 100 comparaciones en el peor caso, la búsqueda binaria localiza el vehículo en un máximo de 7 comparaciones (log₂ 100 ≈ 6.64).</w:t>
-      </w:r>
-    </w:p>
-    <w:p>
-      <w:pPr>
-        <w:keepNext/>
-        <w:spacing w:before="320" w:after="120"/>
-        <w:pBdr>
-          <w:bottom w:val="single" w:sz="12" w:space="3" w:color="CBD5E0"/>
-        </w:pBdr>
-      </w:pPr>
-      <w:r>
-        <w:rPr>
-          <w:rFonts w:ascii="Arial" w:hAnsi="Arial"/>
-          <w:b/>
-          <w:color w:val="1A365D"/>
-          <w:sz w:val="26"/>
-        </w:rPr>
-        <w:t>7. Lógica de Cálculos</w:t>
-      </w:r>
-    </w:p>
-    <w:p>
-      <w:pPr>
-        <w:keepNext/>
-        <w:spacing w:before="200" w:after="80"/>
-      </w:pPr>
-      <w:r>
-        <w:rPr>
-          <w:rFonts w:ascii="Arial" w:hAnsi="Arial"/>
-          <w:b/>
-          <w:color w:val="2B6CB0"/>
-          <w:sz w:val="22"/>
-        </w:rPr>
-        <w:t>7.1. Fórmula Matemática de Autonomía Estimada</w:t>
-      </w:r>
-    </w:p>
-    <w:p>
-      <w:pPr>
-        <w:spacing w:after="120" w:line="276" w:lineRule="auto"/>
-      </w:pPr>
-      <w:r>
-        <w:rPr>
-          <w:rFonts w:ascii="Arial" w:hAnsi="Arial"/>
-          <w:color w:val="2D3748"/>
-          <w:sz w:val="20"/>
-        </w:rPr>
-        <w:t>La autonomía teórica de un vehículo eléctrico representa la distancia en kilómetros que puede recorrer antes de que la batería se descargue totalmente. Se calcula mediante la relación directa:</w:t>
-      </w:r>
-    </w:p>
-    <w:p>
-      <w:pPr>
-        <w:spacing w:after="120" w:line="276" w:lineRule="auto"/>
-      </w:pPr>
-      <w:r>
-        <w:rPr>
-          <w:rFonts w:ascii="Arial" w:hAnsi="Arial"/>
-          <w:color w:val="2D3748"/>
-          <w:sz w:val="20"/>
-        </w:rPr>
-        <w:t xml:space="preserve">            Autonomía (km) = ( Capacidad de Batería (kWh) / Consumo Promedio (kWh/100km) ) * 100</w:t>
-      </w:r>
-    </w:p>
-    <w:p>
-      <w:pPr>
-        <w:keepNext/>
-        <w:spacing w:before="200" w:after="80"/>
-      </w:pPr>
-      <w:r>
-        <w:rPr>
-          <w:rFonts w:ascii="Arial" w:hAnsi="Arial"/>
-          <w:b/>
-          <w:color w:val="2B6CB0"/>
-          <w:sz w:val="22"/>
-        </w:rPr>
-        <w:t>7.2. Uso de Acumuladores para Estadísticas de Flota</w:t>
-      </w:r>
-    </w:p>
-    <w:p>
-      <w:pPr>
-        <w:spacing w:after="120" w:line="276" w:lineRule="auto"/>
-      </w:pPr>
-      <w:r>
-        <w:rPr>
-          <w:rFonts w:ascii="Arial" w:hAnsi="Arial"/>
-          <w:color w:val="2D3748"/>
-          <w:sz w:val="20"/>
-        </w:rPr>
-        <w:t>En la opción 6 ('consultarAutonomia'), el sistema implementa un acumulador de punto flotante ('float acumuladorAutonomia = 0.0f;'). Mediante un bucle iterativo que suma la autonomía de cada vehículo activo, se calcula el promedio aritmético general de la flota ('promedio = acumulador / total'). Esto ofrece a la gerencia un indicador de rendimiento global de su parque automotor.</w:t>
-      </w:r>
-    </w:p>
-    <w:p>
-      <w:pPr>
-        <w:keepNext/>
-        <w:spacing w:before="200" w:after="80"/>
-      </w:pPr>
-      <w:r>
-        <w:rPr>
-          <w:rFonts w:ascii="Arial" w:hAnsi="Arial"/>
-          <w:b/>
-          <w:color w:val="2B6CB0"/>
-          <w:sz w:val="22"/>
-        </w:rPr>
-        <w:t>7.3. Validación Crítica: Prevención de División por Cero</w:t>
-      </w:r>
-    </w:p>
-    <w:p>
-      <w:pPr>
-        <w:spacing w:after="120" w:line="276" w:lineRule="auto"/>
-      </w:pPr>
-      <w:r>
-        <w:rPr>
-          <w:rFonts w:ascii="Arial" w:hAnsi="Arial"/>
-          <w:color w:val="2D3748"/>
-          <w:sz w:val="20"/>
-        </w:rPr>
-        <w:t>La división entre cero es una operación matemática indefinida que a nivel de hardware genera una interrupción de punto flotante o produce valores 'inf' / 'NaN' que corrompen el ordenamiento y las estadísticas. Para blindar el cálculo, la función 'calcularAutonomia' cuenta con una cláusula de guarda estricta:</w:t>
+        <w:t>Para blindar la division contra errores aritmeticos en caso de consumos anomalos, se implemento una clausula de guarda:</w:t>
       </w:r>
     </w:p>
     <w:tbl>
@@ -1939,19 +1952,13 @@
                 <w:color w:val="282C34"/>
                 <w:sz w:val="17"/>
               </w:rPr>
-              <w:t>float calcularAutonomia(const Vehiculo&amp; v) {</w:t>
+              <w:t>def calcular_autonomia(v: Vehiculo) -&gt; float:</w:t>
               <w:br/>
-              <w:t xml:space="preserve">    // Clausula de guarda: previene division por cero o valores negativos</w:t>
+              <w:t xml:space="preserve">    if v.consumo_promedio &lt;= 0.0:</w:t>
               <w:br/>
-              <w:t xml:space="preserve">    if (v.consumoPromedio &lt;= 0.0f) {</w:t>
+              <w:t xml:space="preserve">        return 0.0  # Previene indeterminaciones por division entre cero</w:t>
               <w:br/>
-              <w:t xml:space="preserve">        return 0.0f;</w:t>
-              <w:br/>
-              <w:t xml:space="preserve">    }</w:t>
-              <w:br/>
-              <w:t xml:space="preserve">    return (v.capacidadBateria / v.consumoPromedio) * 100.0f;</w:t>
-              <w:br/>
-              <w:t>}</w:t>
+              <w:t xml:space="preserve">    return (v.capacidad_bateria / v.consumo_promedio) * 100.0</w:t>
             </w:r>
           </w:p>
         </w:tc>
@@ -1969,7 +1976,7 @@
           <w:color w:val="718096"/>
           <w:sz w:val="17"/>
         </w:rPr>
-        <w:t>Fragmento: Prevención de división por cero en el cálculo de autonomía</w:t>
+        <w:t>Fragmento: Clausula de guarda para evitar division por cero</w:t>
       </w:r>
     </w:p>
     <w:p>
@@ -1987,7 +1994,7 @@
           <w:color w:val="1A365D"/>
           <w:sz w:val="26"/>
         </w:rPr>
-        <w:t>8. Lógica de Reportes</w:t>
+        <w:t>8. Logica de Reportes</w:t>
       </w:r>
     </w:p>
     <w:p>
@@ -2002,20 +2009,7 @@
           <w:color w:val="2B6CB0"/>
           <w:sz w:val="22"/>
         </w:rPr>
-        <w:t>8.1. Condiciones y Umbrales Dinámicos</w:t>
-      </w:r>
-    </w:p>
-    <w:p>
-      <w:pPr>
-        <w:spacing w:after="120" w:line="276" w:lineRule="auto"/>
-      </w:pPr>
-      <w:r>
-        <w:rPr>
-          <w:rFonts w:ascii="Arial" w:hAnsi="Arial"/>
-          <w:color w:val="2D3748"/>
-          <w:sz w:val="20"/>
-        </w:rPr>
-        <w:t>El módulo de reportes no trabaja con valores 'cableados' (hardcoded), sino que solicita al usuario los umbrales de filtrado en tiempo de ejecución, otorgando flexibilidad operativa:</w:t>
+        <w:t>8.1. Condiciones y Umbrales Dinamicos</w:t>
       </w:r>
     </w:p>
     <w:p>
@@ -2030,7 +2024,7 @@
           <w:color w:val="1A202C"/>
           <w:sz w:val="20"/>
         </w:rPr>
-        <w:t xml:space="preserve">Reporte de Autonomía Baja: </w:t>
+        <w:t xml:space="preserve">Reporte de Autonomia Baja: </w:t>
       </w:r>
       <w:r>
         <w:rPr>
@@ -2038,7 +2032,7 @@
           <w:color w:val="2D3748"/>
           <w:sz w:val="20"/>
         </w:rPr>
-        <w:t>Condición booleana: 'calcularAutonomia(flota[i]) &lt; umbralKm'. Identifica unidades que requieren recarga prioritaria o vehículos inadecuados para viajes interurbanos.</w:t>
+        <w:t>Condicion: 'calcular_autonomia(v) &lt; umbral_km'. Identifica unidades que precisan recarga inmediata.</w:t>
       </w:r>
     </w:p>
     <w:p>
@@ -2061,7 +2055,7 @@
           <w:color w:val="2D3748"/>
           <w:sz w:val="20"/>
         </w:rPr>
-        <w:t>Condición booleana: 'flota[i].viajesRealizados &gt; umbralViajes'. Identifica unidades con desgaste mecánico acelerado para programar mantenimiento preventivo.</w:t>
+        <w:t>Condicion: 'v.viajes_realizados &gt; umbral_viajes'. Identifica unidades con alto desgaste para programar mantenimiento.</w:t>
       </w:r>
     </w:p>
     <w:p>
@@ -2076,7 +2070,7 @@
           <w:color w:val="2B6CB0"/>
           <w:sz w:val="22"/>
         </w:rPr>
-        <w:t>8.2. Filtrado de Datos y Presentación Tabular</w:t>
+        <w:t>8.2. Filtrado y Presentacion Tabular</w:t>
       </w:r>
     </w:p>
     <w:p>
@@ -2089,7 +2083,7 @@
           <w:color w:val="2D3748"/>
           <w:sz w:val="20"/>
         </w:rPr>
-        <w:t>Ambos reportes aplican un patrón de filtrado secuencial con acumulador de coincidencias ('encontrados'). Los resultados se formatean visualmente como una tabla ASCII profesional utilizando manipuladores 'std::setw', 'std::left', 'std::right', 'std::fixed' y 'std::setprecision(2)' de la biblioteca &lt;iomanip&gt;. Si ninguna unidad cumple la condición del umbral, se notifica claramente al usuario en lugar de presentar una tabla vacía.</w:t>
+        <w:t>Ambos reportes aplican un patron de filtrado con conteo de coincidencias ('encontrados'). Los resultados se formatean en tabla mediante f-strings alineadas con anchos fijos, emitiendo mensajes claros si ningun elemento coincide.</w:t>
       </w:r>
     </w:p>
     <w:p>
@@ -2107,7 +2101,7 @@
           <w:color w:val="1A365D"/>
           <w:sz w:val="26"/>
         </w:rPr>
-        <w:t>9. Lógica del Menú</w:t>
+        <w:t>9. Logica del Menu</w:t>
       </w:r>
     </w:p>
     <w:p>
@@ -2122,7 +2116,7 @@
           <w:color w:val="2B6CB0"/>
           <w:sz w:val="22"/>
         </w:rPr>
-        <w:t>9.1. Implementación del Menú Principal</w:t>
+        <w:t>9.1. Implementacion del Menu</w:t>
       </w:r>
     </w:p>
     <w:p>
@@ -2135,7 +2129,7 @@
           <w:color w:val="2D3748"/>
           <w:sz w:val="20"/>
         </w:rPr>
-        <w:t>El menú de navegación consolida de manera organizada las 9 operaciones requeridas en las bases del examen parcial. Está encapsulado en la función 'main()' y se apoya en una estructura 'switch-case' con invocaciones modulares a funciones especializadas para cada tarea, manteniendo el principio de responsabilidad única.</w:t>
+        <w:t>El menu despliega las 9 opciones solicitadas. Cada operacion esta delegada en su respectiva funcion modular.</w:t>
       </w:r>
     </w:p>
     <w:p>
@@ -2150,7 +2144,7 @@
           <w:color w:val="2B6CB0"/>
           <w:sz w:val="22"/>
         </w:rPr>
-        <w:t>9.2. Uso del Bucle 'do-while'</w:t>
+        <w:t>9.2. Uso de Bucles ('while')</w:t>
       </w:r>
     </w:p>
     <w:p>
@@ -2163,7 +2157,7 @@
           <w:color w:val="2D3748"/>
           <w:sz w:val="20"/>
         </w:rPr>
-        <w:t>Se empleó un bucle 'do-while' con la condición de salida 'opcion != 9'. Esta estructura de control es la óptima para menús de usuario debido a su naturaleza post-test: garantiza que la interfaz se imprima en pantalla al menos una vez y continúe iterando sucesivamente tras cada operación hasta que el usuario decida voluntariamente abandonar el programa.</w:t>
+        <w:t>Se utiliza un bucle 'while opcion != 9'. Esta estructura asegura que la interfaz se muestre de manera continua tras completar cada accion hasta que el operador digite la opcion de salida.</w:t>
       </w:r>
     </w:p>
     <w:p>
@@ -2178,53 +2172,20 @@
           <w:color w:val="2B6CB0"/>
           <w:sz w:val="22"/>
         </w:rPr>
-        <w:t>9.3. Manejo de Errores y Opciones Inválidas</w:t>
+        <w:t>9.3. Manejo de Opciones Invalidas</w:t>
       </w:r>
     </w:p>
     <w:p>
       <w:pPr>
-        <w:pStyle w:val="ListBullet"/>
-        <w:spacing w:after="60" w:line="276" w:lineRule="auto"/>
-      </w:pPr>
-      <w:r>
-        <w:rPr>
-          <w:rFonts w:ascii="Arial" w:hAnsi="Arial"/>
-          <w:b/>
-          <w:color w:val="1A202C"/>
-          <w:sz w:val="20"/>
-        </w:rPr>
-        <w:t xml:space="preserve">Protección contra letras: </w:t>
-      </w:r>
+        <w:spacing w:after="120" w:line="276" w:lineRule="auto"/>
+      </w:pPr>
       <w:r>
         <w:rPr>
           <w:rFonts w:ascii="Arial" w:hAnsi="Arial"/>
           <w:color w:val="2D3748"/>
           <w:sz w:val="20"/>
         </w:rPr>
-        <w:t>Se captura la opción mediante 'leerEnteroMayorIgual', lo que neutraliza caracteres inválidos antes de que alcancen el switch.</w:t>
-      </w:r>
-    </w:p>
-    <w:p>
-      <w:pPr>
-        <w:pStyle w:val="ListBullet"/>
-        <w:spacing w:after="60" w:line="276" w:lineRule="auto"/>
-      </w:pPr>
-      <w:r>
-        <w:rPr>
-          <w:rFonts w:ascii="Arial" w:hAnsi="Arial"/>
-          <w:b/>
-          <w:color w:val="1A202C"/>
-          <w:sz w:val="20"/>
-        </w:rPr>
-        <w:t xml:space="preserve">Cláusula default: </w:t>
-      </w:r>
-      <w:r>
-        <w:rPr>
-          <w:rFonts w:ascii="Arial" w:hAnsi="Arial"/>
-          <w:color w:val="2D3748"/>
-          <w:sz w:val="20"/>
-        </w:rPr>
-        <w:t>Si el usuario digita un entero fuera del rango 1 a 9, la cláusula 'default' del 'switch' captura el evento y muestra el mensaje '[!] Opcion invalida. Por favor seleccione una opcion entre 1 y 9.'.</w:t>
+        <w:t>La captura de opcion utiliza 'leer_entero_mayor_igual', lo que neutraliza caracteres alfabeticos. Adicionalmente, una clausula 'else' final notifica cuando se digita un numero fuera del rango [1, 9].</w:t>
       </w:r>
     </w:p>
     <w:p>
@@ -2260,7 +2221,7 @@
           <w:color w:val="2D3748"/>
           <w:sz w:val="20"/>
         </w:rPr>
-        <w:t>A continuación se documentan las pruebas funcionales exhaustivas ejecutadas sobre el sistema, demostrando el cumplimiento riguroso de cada uno de los requisitos del caso práctico y la estabilidad ante entradas erróneas.</w:t>
+        <w:t>A continuacion se presentan los casos de prueba ejecutados sobre el sistema en Python, acreditando el cumplimiento de las especificaciones tecnicas.</w:t>
       </w:r>
     </w:p>
     <w:p>
@@ -2275,7 +2236,7 @@
           <w:color w:val="2B6CB0"/>
           <w:sz w:val="22"/>
         </w:rPr>
-        <w:t>10.1. Caso de Prueba 1: Registro de Vehículo con Validación de Errores</w:t>
+        <w:t>10.1. Caso de Prueba 1: Registro con Validacion de Errores</w:t>
       </w:r>
     </w:p>
     <w:p>
@@ -2298,7 +2259,7 @@
           <w:color w:val="2D3748"/>
           <w:sz w:val="20"/>
         </w:rPr>
-        <w:t>Verificar que el sistema rechace IDs duplicados, ignore entradas alfabéticas erróneas, valide cotas numéricas y registre una unidad nueva.</w:t>
+        <w:t>Comprobar rechazo de duplicados, control de caracteres alfabeticos y cotas numericas.</w:t>
       </w:r>
     </w:p>
     <w:p>
@@ -2321,7 +2282,7 @@
           <w:color w:val="2D3748"/>
           <w:sz w:val="20"/>
         </w:rPr>
-        <w:t>ID duplicado = 101 (Rechazado); ID letra = 'abc' (Rechazado); ID válido = 105; Capacidad errónea = -10 (Rechazada); Capacidad válida = 69.0; Consumo = 17.5; Viajes = 8; Estado = 1.</w:t>
+        <w:t>ID duplicado = 101; ID letra = 'abc'; ID valido = 105; Capacidad -10 kWh; Capacidad valida = 69.0 kWh; Consumo = 17.5; Viajes = 8; Estado = 1.</w:t>
       </w:r>
     </w:p>
     <w:p>
@@ -2344,7 +2305,7 @@
           <w:color w:val="2D3748"/>
           <w:sz w:val="20"/>
         </w:rPr>
-        <w:t>El sistema bloqueó exitosamente los intentos inválidos y registró el Volvo EX30 con una autonomía calculada de 394.29 km.</w:t>
+        <w:t>Registro exitoso del Volvo EX30 con autonomia inicial calculada de 394.29 km.</w:t>
       </w:r>
     </w:p>
     <w:p>
@@ -2393,7 +2354,7 @@
           <w:i/>
           <w:sz w:val="17"/>
         </w:rPr>
-        <w:t>Figura 1: Evidencia en consola de validaciones durante el registro y rechazo de errores.</w:t>
+        <w:t>Figura 1: Evidencia de validaciones en registro y control de excepciones.</w:t>
       </w:r>
     </w:p>
     <w:p>
@@ -2408,7 +2369,7 @@
           <w:color w:val="2B6CB0"/>
           <w:sz w:val="22"/>
         </w:rPr>
-        <w:t>10.2. Caso de Prueba 2: Búsqueda Secuencial por ID (Éxito y Fallo)</w:t>
+        <w:t>10.2. Caso de Prueba 2: Busqueda Secuencial por ID</w:t>
       </w:r>
     </w:p>
     <w:p>
@@ -2431,7 +2392,7 @@
           <w:color w:val="2D3748"/>
           <w:sz w:val="20"/>
         </w:rPr>
-        <w:t>Comprobar la respuesta de la búsqueda secuencial frente a registros existentes y no existentes.</w:t>
+        <w:t>Comprobar respuesta ante identificadores existentes e inexistentes.</w:t>
       </w:r>
     </w:p>
     <w:p>
@@ -2477,7 +2438,7 @@
           <w:color w:val="2D3748"/>
           <w:sz w:val="20"/>
         </w:rPr>
-        <w:t>Para el ID 103 recuperó la ficha completa con estado 'En mantenimiento' y autonomía de 469.23 km. Para el ID 999 emitió la advertencia correspondiente.</w:t>
+        <w:t>Recuperacion precisa de datos y aviso claro ante clave no encontrada.</w:t>
       </w:r>
     </w:p>
     <w:p>
@@ -2526,7 +2487,7 @@
           <w:i/>
           <w:sz w:val="17"/>
         </w:rPr>
-        <w:t>Figura 2: Evidencia de búsqueda secuencial exitosa y manejo de registro no encontrado.</w:t>
+        <w:t>Figura 2: Evidencia de busqueda secuencial exitosa y manejo de registro inexistente.</w:t>
       </w:r>
     </w:p>
     <w:p>
@@ -2541,7 +2502,7 @@
           <w:color w:val="2B6CB0"/>
           <w:sz w:val="22"/>
         </w:rPr>
-        <w:t>10.3. Caso de Prueba 3: Ordenación por Autonomía Estimada (Método Burbuja)</w:t>
+        <w:t>10.3. Caso de Prueba 3: Ordenacion por Autonomia Estimada (Burbuja)</w:t>
       </w:r>
     </w:p>
     <w:p>
@@ -2564,30 +2525,7 @@
           <w:color w:val="2D3748"/>
           <w:sz w:val="20"/>
         </w:rPr>
-        <w:t>Demostrar que el algoritmo Burbuja ordena correctamente la flota de mayor a menor en base al cálculo derivado de autonomía.</w:t>
-      </w:r>
-    </w:p>
-    <w:p>
-      <w:pPr>
-        <w:pStyle w:val="ListBullet"/>
-        <w:spacing w:after="60" w:line="276" w:lineRule="auto"/>
-      </w:pPr>
-      <w:r>
-        <w:rPr>
-          <w:rFonts w:ascii="Arial" w:hAnsi="Arial"/>
-          <w:b/>
-          <w:color w:val="1A202C"/>
-          <w:sz w:val="20"/>
-        </w:rPr>
-        <w:t xml:space="preserve">Vehículos analizados: </w:t>
-      </w:r>
-      <w:r>
-        <w:rPr>
-          <w:rFonts w:ascii="Arial" w:hAnsi="Arial"/>
-          <w:color w:val="2D3748"/>
-          <w:sz w:val="20"/>
-        </w:rPr>
-        <w:t>BYD Han (469.23 km), Ioniq 5 (427.06 km), Model 3 (400.00 km), Volvo EX30 (394.29 km), Leaf (242.42 km).</w:t>
+        <w:t>Comprobar que el algoritmo Burbuja clasifica la flota de mayor a menor autonomia.</w:t>
       </w:r>
     </w:p>
     <w:p>
@@ -2610,7 +2548,7 @@
           <w:color w:val="2D3748"/>
           <w:sz w:val="20"/>
         </w:rPr>
-        <w:t>La tabla se desplegó con los 5 vehículos ordenados en estricto orden descendente, validando el intercambio físico de registros.</w:t>
+        <w:t>Ordenamiento descendente: BYD Han EV (469.23 km), Ioniq 5 (427.06 km), Model 3 (400.00 km), Volvo EX30 (394.29 km), Leaf (242.42 km).</w:t>
       </w:r>
     </w:p>
     <w:p>
@@ -2659,7 +2597,7 @@
           <w:i/>
           <w:sz w:val="17"/>
         </w:rPr>
-        <w:t>Figura 3: Evidencia del ordenamiento descendente por autonomía estimada y listado general.</w:t>
+        <w:t>Figura 3: Evidencia del ordenamiento descendente por autonomia calculada.</w:t>
       </w:r>
     </w:p>
     <w:p>
@@ -2674,7 +2612,7 @@
           <w:color w:val="2B6CB0"/>
           <w:sz w:val="22"/>
         </w:rPr>
-        <w:t>10.4. Caso de Prueba 4: Generación de Reportes con Filtrado por Umbral</w:t>
+        <w:t>10.4. Caso de Prueba 4: Generacion de Reportes por Umbral</w:t>
       </w:r>
     </w:p>
     <w:p>
@@ -2697,7 +2635,7 @@
           <w:color w:val="2D3748"/>
           <w:sz w:val="20"/>
         </w:rPr>
-        <w:t>Evaluar la capacidad de filtrado dinámico para baja autonomía (&lt; umbral) y alta demanda de viajes (&gt; umbral).</w:t>
+        <w:t>Evaluar filtros de baja autonomia (&lt; umbral) y alta demanda (&gt; umbral).</w:t>
       </w:r>
     </w:p>
     <w:p>
@@ -2720,30 +2658,7 @@
           <w:color w:val="2D3748"/>
           <w:sz w:val="20"/>
         </w:rPr>
-        <w:t>Umbral autonomía = 350.0 km; Umbral viajes = 25 viajes.</w:t>
-      </w:r>
-    </w:p>
-    <w:p>
-      <w:pPr>
-        <w:pStyle w:val="ListBullet"/>
-        <w:spacing w:after="60" w:line="276" w:lineRule="auto"/>
-      </w:pPr>
-      <w:r>
-        <w:rPr>
-          <w:rFonts w:ascii="Arial" w:hAnsi="Arial"/>
-          <w:b/>
-          <w:color w:val="1A202C"/>
-          <w:sz w:val="20"/>
-        </w:rPr>
-        <w:t xml:space="preserve">Resultado: </w:t>
-      </w:r>
-      <w:r>
-        <w:rPr>
-          <w:rFonts w:ascii="Arial" w:hAnsi="Arial"/>
-          <w:color w:val="2D3748"/>
-          <w:sz w:val="20"/>
-        </w:rPr>
-        <w:t>Filtró con precisión el Nissan Leaf (242.42 km &lt; 350 km) en baja autonomía, y seleccionó el BYD Han (40 viajes) y Hyundai Ioniq 5 (30 viajes) en alta demanda.</w:t>
+        <w:t>Autonomia &lt; 350.0 km (filtro: Nissan Leaf con 242.42 km); Viajes &gt; 25 (filtro: BYD Han con 40 y Hyundai Ioniq 5 con 30).</w:t>
       </w:r>
     </w:p>
     <w:p>
@@ -2792,7 +2707,7 @@
           <w:i/>
           <w:sz w:val="17"/>
         </w:rPr>
-        <w:t>Figura 4: Evidencia de los reportes condicionales de autonomía baja y alta demanda.</w:t>
+        <w:t>Figura 4: Evidencia de los reportes condicionales de autonomia y viajes.</w:t>
       </w:r>
     </w:p>
     <w:p>
@@ -2807,7 +2722,7 @@
           <w:color w:val="2B6CB0"/>
           <w:sz w:val="22"/>
         </w:rPr>
-        <w:t>10.5. Caso de Prueba 5: Actualización de Viajes y Cambio de Estado Operativo</w:t>
+        <w:t>10.5. Caso de Prueba 5: Actualizacion de Viajes y Cambio de Estado</w:t>
       </w:r>
     </w:p>
     <w:p>
@@ -2830,7 +2745,7 @@
           <w:color w:val="2D3748"/>
           <w:sz w:val="20"/>
         </w:rPr>
-        <w:t>Comprobar la persistencia en memoria durante la ejecución de las operaciones de actualización y conmutación de estado.</w:t>
+        <w:t>Comprobar la persistencia en memoria durante la ejecucion.</w:t>
       </w:r>
     </w:p>
     <w:p>
@@ -2845,7 +2760,7 @@
           <w:color w:val="1A202C"/>
           <w:sz w:val="20"/>
         </w:rPr>
-        <w:t xml:space="preserve">Acciones ejecutadas: </w:t>
+        <w:t xml:space="preserve">Acciones: </w:t>
       </w:r>
       <w:r>
         <w:rPr>
@@ -2853,30 +2768,7 @@
           <w:color w:val="2D3748"/>
           <w:sz w:val="20"/>
         </w:rPr>
-        <w:t>ID 102 (Nissan Leaf): viajes aumentados de 12 a 18. ID 103 (BYD Han): estado conmutado de [2] Mantenimiento a [1] Disponible.</w:t>
-      </w:r>
-    </w:p>
-    <w:p>
-      <w:pPr>
-        <w:pStyle w:val="ListBullet"/>
-        <w:spacing w:after="60" w:line="276" w:lineRule="auto"/>
-      </w:pPr>
-      <w:r>
-        <w:rPr>
-          <w:rFonts w:ascii="Arial" w:hAnsi="Arial"/>
-          <w:b/>
-          <w:color w:val="1A202C"/>
-          <w:sz w:val="20"/>
-        </w:rPr>
-        <w:t xml:space="preserve">Resultado: </w:t>
-      </w:r>
-      <w:r>
-        <w:rPr>
-          <w:rFonts w:ascii="Arial" w:hAnsi="Arial"/>
-          <w:color w:val="2D3748"/>
-          <w:sz w:val="20"/>
-        </w:rPr>
-        <w:t>Ambas mutaciones se ejecutaron sin efectos colaterales en los demás atributos de los registros.</w:t>
+        <w:t>ID 102 (Nissan Leaf): viajes aumentados de 12 a 18. ID 103 (BYD Han): estado conmutado de [2] En mantenimiento a [1] Disponible.</w:t>
       </w:r>
     </w:p>
     <w:p>
@@ -2925,7 +2817,7 @@
           <w:i/>
           <w:sz w:val="17"/>
         </w:rPr>
-        <w:t>Figura 5: Evidencia de actualización de odómetro y conmutación de estado operativo.</w:t>
+        <w:t>Figura 5: Evidencia de actualizacion de viajes y cambio de estado.</w:t>
       </w:r>
     </w:p>
     <w:p>
@@ -2958,7 +2850,7 @@
           <w:color w:val="2B6CB0"/>
           <w:sz w:val="22"/>
         </w:rPr>
-        <w:t>11.1. Reflexión sobre las Limitaciones del Sistema Estático</w:t>
+        <w:t>11.1. Reflexion sobre las Limitaciones del Sistema Estatico</w:t>
       </w:r>
     </w:p>
     <w:p>
@@ -2971,7 +2863,7 @@
           <w:color w:val="2D3748"/>
           <w:sz w:val="20"/>
         </w:rPr>
-        <w:t>El sistema desarrollado satisface plenamente los requerimientos académicos del Examen Parcial de Estructura de Datos. Sin embargo, el análisis crítico de su arquitectura evidencia limitaciones intrínsecas derivadas del almacenamiento estático y la volatilidad de la memoria RAM: al finalizar el programa, toda la información de la flota se pierde. Asimismo, el límite rígido de 100 vehículos impone una barrera de crecimiento que requiere intervención en el código fuente.</w:t>
+        <w:t>El programa cumple los requerimientos curriculares de Estructura de Datos. No obstante, sufre de limitaciones: volatilidad de datos en RAM al cerrar el proceso y limite rigido de 100 vehiculos.</w:t>
       </w:r>
     </w:p>
     <w:p>
@@ -2986,7 +2878,7 @@
           <w:color w:val="2B6CB0"/>
           <w:sz w:val="22"/>
         </w:rPr>
-        <w:t>11.2. Propuestas Técnicas de Evolución</w:t>
+        <w:t>11.2. Propuestas Tecnicas de Evolucion</w:t>
       </w:r>
     </w:p>
     <w:p>
@@ -3001,7 +2893,7 @@
           <w:color w:val="1A202C"/>
           <w:sz w:val="20"/>
         </w:rPr>
-        <w:t xml:space="preserve">1. Implementación de Estructuras de Datos Dinámicas: </w:t>
+        <w:t xml:space="preserve">1. Estructuras Dinamicas: </w:t>
       </w:r>
       <w:r>
         <w:rPr>
@@ -3009,7 +2901,7 @@
           <w:color w:val="2D3748"/>
           <w:sz w:val="20"/>
         </w:rPr>
-        <w:t>Reemplazar el arreglo estático por una Lista Simplemente Enlazada o Doblemente Enlazada (o en su defecto un 'std::vector' de C++). Esto permitirá reservar y liberar nodos en memoria heap mediante operadores 'new' y 'delete' en tiempo de ejecución, logrando una flota de tamaño elástico ilimitado que crece y decrece de acuerdo con la demanda real sin desperdiciar bytes.</w:t>
+        <w:t>Migrar a listas enlazadas manuales o aprovechar listas dinamicas elásticas de Python sin tope de memoria prefijado.</w:t>
       </w:r>
     </w:p>
     <w:p>
@@ -3024,7 +2916,7 @@
           <w:color w:val="1A202C"/>
           <w:sz w:val="20"/>
         </w:rPr>
-        <w:t xml:space="preserve">2. Persistencia en Archivos de Disco (Ficheros): </w:t>
+        <w:t xml:space="preserve">2. Persistencia en Archivos: </w:t>
       </w:r>
       <w:r>
         <w:rPr>
@@ -3032,7 +2924,7 @@
           <w:color w:val="2D3748"/>
           <w:sz w:val="20"/>
         </w:rPr>
-        <w:t>Integrar la biblioteca '&lt;fstream&gt;' de C++ para implementar persistencia de datos en archivos planos (.txt, .csv) o binarios (.dat). De este modo, al iniciar la aplicación se cargará el estado previo de la flota automáticamente y, al salir, se guardarán los cambios realizados, evitando la pérdida de información entre sesiones de trabajo.</w:t>
+        <w:t>Integrar los modulos 'json' o 'csv' de Python para persistir la flota en disco al salir y cargarla al inicio.</w:t>
       </w:r>
     </w:p>
     <w:p>
@@ -3047,7 +2939,7 @@
           <w:color w:val="1A202C"/>
           <w:sz w:val="20"/>
         </w:rPr>
-        <w:t xml:space="preserve">3. Integración con Motor de Base de Datos Relacional: </w:t>
+        <w:t xml:space="preserve">3. Base de Datos Relacional: </w:t>
       </w:r>
       <w:r>
         <w:rPr>
@@ -3055,7 +2947,7 @@
           <w:color w:val="2D3748"/>
           <w:sz w:val="20"/>
         </w:rPr>
-        <w:t>Para un entorno corporativo real con múltiples sucursales concurrentes, se recomienda conectar la lógica de negocio con una base de datos relacional ligera como SQLite o cliente-servidor (PostgreSQL / MySQL). Esto proporcionaría propiedades ACID (Atomicidad, Consistencia, Aislamiento y Durabilidad), indexación mediante árboles B+ y soporte para consultas transaccionales concurrentes.</w:t>
+        <w:t>Incorporar SQLite mediante el modulo nativo 'sqlite3' para soporte ACID transaccional.</w:t>
       </w:r>
     </w:p>
     <w:p>
@@ -3070,7 +2962,7 @@
           <w:color w:val="1A202C"/>
           <w:sz w:val="20"/>
         </w:rPr>
-        <w:t xml:space="preserve">4. Interfaz Gráfica de Usuario (GUI) y Dashboard: </w:t>
+        <w:t xml:space="preserve">4. Interfaz Grafica o Web: </w:t>
       </w:r>
       <w:r>
         <w:rPr>
@@ -3078,7 +2970,7 @@
           <w:color w:val="2D3748"/>
           <w:sz w:val="20"/>
         </w:rPr>
-        <w:t>Migrar la consola de comandos hacia una interfaz gráfica amigable (empleando frameworks como Qt C++ o wxWidgets, o mediante una API REST en C++ conectada a un frontend web). Esto habilitaría paneles de control visual con gráficos de barras para la autonomía, alertas cromáticas de mantenimiento y mapas de geolocalización de las unidades.</w:t>
+        <w:t>Implementar una interfaz de usuario con Tkinter / PyQt o un dashboard con Flask / Streamlit.</w:t>
       </w:r>
     </w:p>
     <w:sectPr>

</xml_diff>